<commit_message>
Offline operation: network-blocked run, timing, title and IMU future work
- droneloc/offline.py: blocked_network() guard and a benchmark that trains
  and runs the realistic passive chain with all connections blocked
  (one core: 209 ms per 250 ms hop, real-time factor 0.84)
- test: the offline chain completes and the guard blocks a real request
- manuscript: 'Offline' in the title, abstract, keywords, motivation,
  contribution, Section 7.7 with Table 11, conclusions; future work on a
  nine-axis IMU (accelerometer, gyroscope, 3D compass) for earth-frame
  directions; cover letter and highlights updated
- Arabic hardware guide: IMU / 3D compass section

Co-Authored-By: Claude Opus 5.5 <noreply@anthropic.com>
Claude-Session: https://claude.ai/code/session_01Tjp7tKuW9QND1aAEqAWhGA
</commit_message>
<xml_diff>
--- a/docs/Hardware_Guide_AR.docx
+++ b/docs/Hardware_Guide_AR.docx
@@ -3615,7 +3615,487 @@
           <w:rFonts w:ascii="Arial" w:cs="Arial" w:eastAsia="Arial" w:hAnsi="Arial"/>
           <w:rtl/>
         </w:rPr>
-        <w:t xml:space="preserve">6. ملاحظات السلامة</w:t>
+        <w:t xml:space="preserve">6. مرحلة لاحقة: مقياس تسارع وبوصلة ثلاثية الأبعاد (IMU)</w:t>
+      </w:r>
+    </w:p>
+    <w:p>
+      <w:pPr>
+        <w:bidi/>
+        <w:spacing w:after="120" w:line="300"/>
+        <w:jc w:val="right"/>
+      </w:pPr>
+      <w:r>
+        <w:rPr>
+          <w:rFonts w:ascii="Arial" w:cs="Arial" w:eastAsia="Arial" w:hAnsi="Arial"/>
+          <w:rtl/>
+        </w:rPr>
+        <w:t xml:space="preserve">المصفوفة تقيس اتجاه الصوت بالنسبة لمحاورها هي. إذا مالت الطائرة أو دارت، يتغيّر الاتجاه المقاس حتى لو بقي المصدر ثابتاً. ظهر ذلك بوضوح في تسجيلات DREGON: السمت يدور على كامل الدائرة مع دوران الطائرة. وحدة قياس الحركة (مقياس تسارع + جيروسكوب + بوصلة مغناطيسية، كلها ثلاثية المحاور) تعطي اتجاه المصفوفة في كل لحظة، فنحوّل اتجاه الصوت إلى محاور الأرض (الشمال، الشرق، الأعلى)، دون إنترنت ودون GPS.</w:t>
+      </w:r>
+    </w:p>
+    <w:tbl>
+      <w:tblPr>
+        <w:bidiVisual/>
+        <w:tblW w:type="dxa" w:w="9070"/>
+        <w:tblBorders>
+          <w:top w:val="single" w:color="auto" w:sz="4"/>
+          <w:left w:val="single" w:color="auto" w:sz="4"/>
+          <w:bottom w:val="single" w:color="auto" w:sz="4"/>
+          <w:right w:val="single" w:color="auto" w:sz="4"/>
+          <w:insideH w:val="single" w:color="auto" w:sz="4"/>
+          <w:insideV w:val="single" w:color="auto" w:sz="4"/>
+        </w:tblBorders>
+      </w:tblPr>
+      <w:tblGrid>
+        <w:gridCol w:w="4200"/>
+        <w:gridCol w:w="1300"/>
+        <w:gridCol w:w="3570"/>
+      </w:tblGrid>
+      <w:tr>
+        <w:trPr>
+          <w:tblHeader/>
+        </w:trPr>
+        <w:tc>
+          <w:tcPr>
+            <w:tcW w:type="dxa" w:w="4200"/>
+            <w:tcBorders>
+              <w:top w:val="single" w:color="A6A6A6" w:sz="4"/>
+              <w:left w:val="single" w:color="A6A6A6" w:sz="4"/>
+              <w:bottom w:val="single" w:color="A6A6A6" w:sz="4"/>
+              <w:right w:val="single" w:color="A6A6A6" w:sz="4"/>
+            </w:tcBorders>
+            <w:shd w:fill="DCE3F0" w:color="auto" w:val="clear"/>
+            <w:tcMar>
+              <w:top w:type="dxa" w:w="50"/>
+              <w:left w:type="dxa" w:w="80"/>
+              <w:bottom w:type="dxa" w:w="50"/>
+              <w:right w:type="dxa" w:w="80"/>
+            </w:tcMar>
+          </w:tcPr>
+          <w:p>
+            <w:pPr>
+              <w:bidi/>
+              <w:jc w:val="right"/>
+            </w:pPr>
+            <w:r>
+              <w:rPr>
+                <w:rFonts w:ascii="Arial" w:cs="Arial" w:eastAsia="Arial" w:hAnsi="Arial"/>
+                <w:b/>
+                <w:bCs/>
+                <w:sz w:val="19"/>
+                <w:szCs w:val="19"/>
+                <w:rtl/>
+              </w:rPr>
+              <w:t xml:space="preserve">القطعة</w:t>
+            </w:r>
+          </w:p>
+        </w:tc>
+        <w:tc>
+          <w:tcPr>
+            <w:tcW w:type="dxa" w:w="1300"/>
+            <w:tcBorders>
+              <w:top w:val="single" w:color="A6A6A6" w:sz="4"/>
+              <w:left w:val="single" w:color="A6A6A6" w:sz="4"/>
+              <w:bottom w:val="single" w:color="A6A6A6" w:sz="4"/>
+              <w:right w:val="single" w:color="A6A6A6" w:sz="4"/>
+            </w:tcBorders>
+            <w:shd w:fill="DCE3F0" w:color="auto" w:val="clear"/>
+            <w:tcMar>
+              <w:top w:type="dxa" w:w="50"/>
+              <w:left w:type="dxa" w:w="80"/>
+              <w:bottom w:type="dxa" w:w="50"/>
+              <w:right w:type="dxa" w:w="80"/>
+            </w:tcMar>
+          </w:tcPr>
+          <w:p>
+            <w:pPr>
+              <w:bidi/>
+              <w:jc w:val="right"/>
+            </w:pPr>
+            <w:r>
+              <w:rPr>
+                <w:rFonts w:ascii="Arial" w:cs="Arial" w:eastAsia="Arial" w:hAnsi="Arial"/>
+                <w:b/>
+                <w:bCs/>
+                <w:sz w:val="19"/>
+                <w:szCs w:val="19"/>
+                <w:rtl/>
+              </w:rPr>
+              <w:t xml:space="preserve">السعر التقريبي</w:t>
+            </w:r>
+          </w:p>
+        </w:tc>
+        <w:tc>
+          <w:tcPr>
+            <w:tcW w:type="dxa" w:w="3570"/>
+            <w:tcBorders>
+              <w:top w:val="single" w:color="A6A6A6" w:sz="4"/>
+              <w:left w:val="single" w:color="A6A6A6" w:sz="4"/>
+              <w:bottom w:val="single" w:color="A6A6A6" w:sz="4"/>
+              <w:right w:val="single" w:color="A6A6A6" w:sz="4"/>
+            </w:tcBorders>
+            <w:shd w:fill="DCE3F0" w:color="auto" w:val="clear"/>
+            <w:tcMar>
+              <w:top w:type="dxa" w:w="50"/>
+              <w:left w:type="dxa" w:w="80"/>
+              <w:bottom w:type="dxa" w:w="50"/>
+              <w:right w:type="dxa" w:w="80"/>
+            </w:tcMar>
+          </w:tcPr>
+          <w:p>
+            <w:pPr>
+              <w:bidi/>
+              <w:jc w:val="right"/>
+            </w:pPr>
+            <w:r>
+              <w:rPr>
+                <w:rFonts w:ascii="Arial" w:cs="Arial" w:eastAsia="Arial" w:hAnsi="Arial"/>
+                <w:b/>
+                <w:bCs/>
+                <w:sz w:val="19"/>
+                <w:szCs w:val="19"/>
+                <w:rtl/>
+              </w:rPr>
+              <w:t xml:space="preserve">ملاحظات</w:t>
+            </w:r>
+          </w:p>
+        </w:tc>
+      </w:tr>
+      <w:tr>
+        <w:tc>
+          <w:tcPr>
+            <w:tcW w:type="dxa" w:w="4200"/>
+            <w:tcBorders>
+              <w:top w:val="single" w:color="A6A6A6" w:sz="4"/>
+              <w:left w:val="single" w:color="A6A6A6" w:sz="4"/>
+              <w:bottom w:val="single" w:color="A6A6A6" w:sz="4"/>
+              <w:right w:val="single" w:color="A6A6A6" w:sz="4"/>
+            </w:tcBorders>
+            <w:tcMar>
+              <w:top w:type="dxa" w:w="50"/>
+              <w:left w:type="dxa" w:w="80"/>
+              <w:bottom w:type="dxa" w:w="50"/>
+              <w:right w:type="dxa" w:w="80"/>
+            </w:tcMar>
+          </w:tcPr>
+          <w:p>
+            <w:pPr>
+              <w:bidi/>
+              <w:jc w:val="right"/>
+            </w:pPr>
+            <w:r>
+              <w:rPr>
+                <w:rFonts w:ascii="Arial" w:cs="Arial" w:eastAsia="Arial" w:hAnsi="Arial"/>
+                <w:sz w:val="19"/>
+                <w:szCs w:val="19"/>
+                <w:rtl/>
+              </w:rPr>
+              <w:t xml:space="preserve">Adafruit 9-DOF Orientation IMU Fusion Breakout – BNO085</w:t>
+            </w:r>
+          </w:p>
+        </w:tc>
+        <w:tc>
+          <w:tcPr>
+            <w:tcW w:type="dxa" w:w="1300"/>
+            <w:tcBorders>
+              <w:top w:val="single" w:color="A6A6A6" w:sz="4"/>
+              <w:left w:val="single" w:color="A6A6A6" w:sz="4"/>
+              <w:bottom w:val="single" w:color="A6A6A6" w:sz="4"/>
+              <w:right w:val="single" w:color="A6A6A6" w:sz="4"/>
+            </w:tcBorders>
+            <w:tcMar>
+              <w:top w:type="dxa" w:w="50"/>
+              <w:left w:type="dxa" w:w="80"/>
+              <w:bottom w:type="dxa" w:w="50"/>
+              <w:right w:type="dxa" w:w="80"/>
+            </w:tcMar>
+          </w:tcPr>
+          <w:p>
+            <w:pPr>
+              <w:bidi/>
+              <w:jc w:val="right"/>
+            </w:pPr>
+            <w:r>
+              <w:rPr>
+                <w:rFonts w:ascii="Arial" w:cs="Arial" w:eastAsia="Arial" w:hAnsi="Arial"/>
+                <w:sz w:val="19"/>
+                <w:szCs w:val="19"/>
+                <w:rtl/>
+              </w:rPr>
+              <w:t xml:space="preserve">≈ 25 $</w:t>
+            </w:r>
+          </w:p>
+        </w:tc>
+        <w:tc>
+          <w:tcPr>
+            <w:tcW w:type="dxa" w:w="3570"/>
+            <w:tcBorders>
+              <w:top w:val="single" w:color="A6A6A6" w:sz="4"/>
+              <w:left w:val="single" w:color="A6A6A6" w:sz="4"/>
+              <w:bottom w:val="single" w:color="A6A6A6" w:sz="4"/>
+              <w:right w:val="single" w:color="A6A6A6" w:sz="4"/>
+            </w:tcBorders>
+            <w:tcMar>
+              <w:top w:type="dxa" w:w="50"/>
+              <w:left w:type="dxa" w:w="80"/>
+              <w:bottom w:type="dxa" w:w="50"/>
+              <w:right w:type="dxa" w:w="80"/>
+            </w:tcMar>
+          </w:tcPr>
+          <w:p>
+            <w:pPr>
+              <w:bidi/>
+              <w:jc w:val="right"/>
+            </w:pPr>
+            <w:r>
+              <w:rPr>
+                <w:rFonts w:ascii="Arial" w:cs="Arial" w:eastAsia="Arial" w:hAnsi="Arial"/>
+                <w:sz w:val="19"/>
+                <w:szCs w:val="19"/>
+                <w:rtl/>
+              </w:rPr>
+              <w:t xml:space="preserve">يدمج الحساسات داخلياً ويعطي الاتجاه جاهزاً (Quaternion)؛ يوصل بـ I2C أو UART؛ الأسهل</w:t>
+            </w:r>
+          </w:p>
+        </w:tc>
+      </w:tr>
+      <w:tr>
+        <w:tc>
+          <w:tcPr>
+            <w:tcW w:type="dxa" w:w="4200"/>
+            <w:tcBorders>
+              <w:top w:val="single" w:color="A6A6A6" w:sz="4"/>
+              <w:left w:val="single" w:color="A6A6A6" w:sz="4"/>
+              <w:bottom w:val="single" w:color="A6A6A6" w:sz="4"/>
+              <w:right w:val="single" w:color="A6A6A6" w:sz="4"/>
+            </w:tcBorders>
+            <w:tcMar>
+              <w:top w:type="dxa" w:w="50"/>
+              <w:left w:type="dxa" w:w="80"/>
+              <w:bottom w:type="dxa" w:w="50"/>
+              <w:right w:type="dxa" w:w="80"/>
+            </w:tcMar>
+          </w:tcPr>
+          <w:p>
+            <w:pPr>
+              <w:bidi/>
+              <w:jc w:val="right"/>
+            </w:pPr>
+            <w:r>
+              <w:rPr>
+                <w:rFonts w:ascii="Arial" w:cs="Arial" w:eastAsia="Arial" w:hAnsi="Arial"/>
+                <w:sz w:val="19"/>
+                <w:szCs w:val="19"/>
+                <w:rtl/>
+              </w:rPr>
+              <w:t xml:space="preserve">بديل: لوحة ICM-20948 (9 محاور)</w:t>
+            </w:r>
+          </w:p>
+        </w:tc>
+        <w:tc>
+          <w:tcPr>
+            <w:tcW w:type="dxa" w:w="1300"/>
+            <w:tcBorders>
+              <w:top w:val="single" w:color="A6A6A6" w:sz="4"/>
+              <w:left w:val="single" w:color="A6A6A6" w:sz="4"/>
+              <w:bottom w:val="single" w:color="A6A6A6" w:sz="4"/>
+              <w:right w:val="single" w:color="A6A6A6" w:sz="4"/>
+            </w:tcBorders>
+            <w:tcMar>
+              <w:top w:type="dxa" w:w="50"/>
+              <w:left w:type="dxa" w:w="80"/>
+              <w:bottom w:type="dxa" w:w="50"/>
+              <w:right w:type="dxa" w:w="80"/>
+            </w:tcMar>
+          </w:tcPr>
+          <w:p>
+            <w:pPr>
+              <w:bidi/>
+              <w:jc w:val="right"/>
+            </w:pPr>
+            <w:r>
+              <w:rPr>
+                <w:rFonts w:ascii="Arial" w:cs="Arial" w:eastAsia="Arial" w:hAnsi="Arial"/>
+                <w:sz w:val="19"/>
+                <w:szCs w:val="19"/>
+                <w:rtl/>
+              </w:rPr>
+              <w:t xml:space="preserve">≈ 15 $</w:t>
+            </w:r>
+          </w:p>
+        </w:tc>
+        <w:tc>
+          <w:tcPr>
+            <w:tcW w:type="dxa" w:w="3570"/>
+            <w:tcBorders>
+              <w:top w:val="single" w:color="A6A6A6" w:sz="4"/>
+              <w:left w:val="single" w:color="A6A6A6" w:sz="4"/>
+              <w:bottom w:val="single" w:color="A6A6A6" w:sz="4"/>
+              <w:right w:val="single" w:color="A6A6A6" w:sz="4"/>
+            </w:tcBorders>
+            <w:tcMar>
+              <w:top w:type="dxa" w:w="50"/>
+              <w:left w:type="dxa" w:w="80"/>
+              <w:bottom w:type="dxa" w:w="50"/>
+              <w:right w:type="dxa" w:w="80"/>
+            </w:tcMar>
+          </w:tcPr>
+          <w:p>
+            <w:pPr>
+              <w:bidi/>
+              <w:jc w:val="right"/>
+            </w:pPr>
+            <w:r>
+              <w:rPr>
+                <w:rFonts w:ascii="Arial" w:cs="Arial" w:eastAsia="Arial" w:hAnsi="Arial"/>
+                <w:sz w:val="19"/>
+                <w:szCs w:val="19"/>
+                <w:rtl/>
+              </w:rPr>
+              <w:t xml:space="preserve">قراءات خام؛ الدمج يتم في البرنامج</w:t>
+            </w:r>
+          </w:p>
+        </w:tc>
+      </w:tr>
+    </w:tbl>
+    <w:p/>
+    <w:p>
+      <w:pPr>
+        <w:pStyle w:val="ListParagraph"/>
+        <w:numPr>
+          <w:ilvl w:val="0"/>
+          <w:numId w:val="2"/>
+        </w:numPr>
+        <w:bidi/>
+        <w:spacing w:after="60" w:line="300"/>
+        <w:jc w:val="right"/>
+      </w:pPr>
+      <w:r>
+        <w:rPr>
+          <w:rFonts w:ascii="Arial" w:cs="Arial" w:eastAsia="Arial" w:hAnsi="Arial"/>
+          <w:b/>
+          <w:bCs/>
+          <w:rtl/>
+        </w:rPr>
+        <w:t xml:space="preserve">التركيب:</w:t>
+      </w:r>
+      <w:r>
+        <w:rPr>
+          <w:rFonts w:ascii="Arial" w:cs="Arial" w:eastAsia="Arial" w:hAnsi="Arial"/>
+          <w:rtl/>
+        </w:rPr>
+        <w:t xml:space="preserve"> ثبّت اللوحة بإحكام في مركز الكرة أو على إطارها، ومحاورها موازية لمحاور الميكروفونات (±x ±y ±z).</w:t>
+      </w:r>
+    </w:p>
+    <w:p>
+      <w:pPr>
+        <w:pStyle w:val="ListParagraph"/>
+        <w:numPr>
+          <w:ilvl w:val="0"/>
+          <w:numId w:val="2"/>
+        </w:numPr>
+        <w:bidi/>
+        <w:spacing w:after="60" w:line="300"/>
+        <w:jc w:val="right"/>
+      </w:pPr>
+      <w:r>
+        <w:rPr>
+          <w:rFonts w:ascii="Arial" w:cs="Arial" w:eastAsia="Arial" w:hAnsi="Arial"/>
+          <w:b/>
+          <w:bCs/>
+          <w:rtl/>
+        </w:rPr>
+        <w:t xml:space="preserve">البوصلة والمحركات:</w:t>
+      </w:r>
+      <w:r>
+        <w:rPr>
+          <w:rFonts w:ascii="Arial" w:cs="Arial" w:eastAsia="Arial" w:hAnsi="Arial"/>
+          <w:rtl/>
+        </w:rPr>
+        <w:t xml:space="preserve"> المحركات وكابلات البطارية تشوّش البوصلة المغناطيسية. أبعد اللوحة عنها قدر الإمكان، وعايرها بتدويرها في كل الاتجاهات (حركة رقم 8) بعد تركيبها على الدرون. أثناء التيار العالي اعتمد على الجيروسكوب ومقياس التسارع لفترات قصيرة.</w:t>
+      </w:r>
+    </w:p>
+    <w:p>
+      <w:pPr>
+        <w:pStyle w:val="ListParagraph"/>
+        <w:numPr>
+          <w:ilvl w:val="0"/>
+          <w:numId w:val="2"/>
+        </w:numPr>
+        <w:bidi/>
+        <w:spacing w:after="60" w:line="300"/>
+        <w:jc w:val="right"/>
+      </w:pPr>
+      <w:r>
+        <w:rPr>
+          <w:rFonts w:ascii="Arial" w:cs="Arial" w:eastAsia="Arial" w:hAnsi="Arial"/>
+          <w:b/>
+          <w:bCs/>
+          <w:rtl/>
+        </w:rPr>
+        <w:t xml:space="preserve">التوصيل والتزامن:</w:t>
+      </w:r>
+      <w:r>
+        <w:rPr>
+          <w:rFonts w:ascii="Arial" w:cs="Arial" w:eastAsia="Arial" w:hAnsi="Arial"/>
+          <w:rtl/>
+        </w:rPr>
+        <w:t xml:space="preserve"> صِل اللوحة بنفس الحاسوب الذي يسجّل الصوت (Raspberry Pi عبر I2C)، وسجّل وقت كل قراءة بساعة الحاسوب نفسها. للتحقق من التزامن: انقر الكرة نقرة خفيفة، فيجب أن تظهر النقرة في الصوت وفي مقياس التسارع في اللحظة نفسها.</w:t>
+      </w:r>
+    </w:p>
+    <w:p>
+      <w:pPr>
+        <w:pStyle w:val="ListParagraph"/>
+        <w:numPr>
+          <w:ilvl w:val="0"/>
+          <w:numId w:val="2"/>
+        </w:numPr>
+        <w:bidi/>
+        <w:spacing w:after="60" w:line="300"/>
+        <w:jc w:val="right"/>
+      </w:pPr>
+      <w:r>
+        <w:rPr>
+          <w:rFonts w:ascii="Arial" w:cs="Arial" w:eastAsia="Arial" w:hAnsi="Arial"/>
+          <w:b/>
+          <w:bCs/>
+          <w:rtl/>
+        </w:rPr>
+        <w:t xml:space="preserve">فائدة إضافية:</w:t>
+      </w:r>
+      <w:r>
+        <w:rPr>
+          <w:rFonts w:ascii="Arial" w:cs="Arial" w:eastAsia="Arial" w:hAnsi="Arial"/>
+          <w:rtl/>
+        </w:rPr>
+        <w:t xml:space="preserve"> مقياس التسارع يقيس اهتزاز الهيكل، فيمكن استخدامه مرجعاً اهتزازياً في طرح الضجيج.</w:t>
+      </w:r>
+    </w:p>
+    <w:p>
+      <w:pPr>
+        <w:bidi/>
+        <w:spacing w:after="120" w:line="300"/>
+        <w:jc w:val="right"/>
+      </w:pPr>
+      <w:r>
+        <w:rPr>
+          <w:rFonts w:ascii="Arial" w:cs="Arial" w:eastAsia="Arial" w:hAnsi="Arial"/>
+          <w:rtl/>
+        </w:rPr>
+        <w:t xml:space="preserve">هذه المرحلة مذكورة في المقالة ضمن العمل المستقبلي، ولم تُضف بعد إلى الكود.</w:t>
+      </w:r>
+    </w:p>
+    <w:p>
+      <w:pPr>
+        <w:pStyle w:val="Heading1"/>
+        <w:bidi/>
+        <w:jc w:val="right"/>
+      </w:pPr>
+      <w:r>
+        <w:rPr>
+          <w:rFonts w:ascii="Arial" w:cs="Arial" w:eastAsia="Arial" w:hAnsi="Arial"/>
+          <w:rtl/>
+        </w:rPr>
+        <w:t xml:space="preserve">7. ملاحظات السلامة</w:t>
       </w:r>
     </w:p>
     <w:p>

</xml_diff>

<commit_message>
Clean repository for a first submission (version 2.2.0)
- remove the internal pre-submission review documents
- docs/revision -> docs/results; experiment scripts renamed
  (run_experiments.py, summarize_results.py, make_figures.py);
  outputs/revision -> outputs/results
- comments, README and the Arabic hardware guide no longer refer to a
  review; manuscript data statement and software reference cite the
  Zenodo concept DOI and the new paths

Co-Authored-By: Claude Opus 5.5 <noreply@anthropic.com>
Claude-Session: https://claude.ai/code/session_01Tjp7tKuW9QND1aAEqAWhGA
</commit_message>
<xml_diff>
--- a/docs/Hardware_Guide_AR.docx
+++ b/docs/Hardware_Guide_AR.docx
@@ -35,7 +35,7 @@
           <w:szCs w:val="24"/>
           <w:rtl/>
         </w:rPr>
-        <w:t xml:space="preserve">قائمة القطع، التوصيل، والاختبارات المطلوبة للرد على المحكّم بالبيانات الحقيقية</w:t>
+        <w:t xml:space="preserve">قائمة القطع، التوصيل، والاختبارات المطلوبة للتحقق بالبيانات الحقيقية</w:t>
       </w:r>
     </w:p>
     <w:p>
@@ -63,7 +63,7 @@
           <w:rFonts w:ascii="Arial" w:cs="Arial" w:eastAsia="Arial" w:hAnsi="Arial"/>
           <w:rtl/>
         </w:rPr>
-        <w:t xml:space="preserve">أهم ملاحظات المحكّم أن كل النتائج من المحاكاة. المحاكاة المحدّثة أصبحت أكثر واقعية (تشتت الكرة الصلبة، أخطاء المعايرة، اختلاف الساعة، ضجيج المراوح الموزّع)، لكنها أظهرت أن </w:t>
+        <w:t xml:space="preserve">نتائج الحساس الكروي حتى الآن من المحاكاة. المحاكاة المحدّثة أصبحت أكثر واقعية (تشتت الكرة الصلبة، أخطاء المعايرة، اختلاف الساعة، ضجيج المراوح الموزّع)، لكنها أظهرت أن </w:t>
       </w:r>
       <w:r>
         <w:rPr>
@@ -2377,7 +2377,7 @@
                 <w:szCs w:val="19"/>
                 <w:rtl/>
               </w:rPr>
-              <w:t xml:space="preserve">تعليق المحكّم</w:t>
+              <w:t xml:space="preserve">ما يحسمه</w:t>
             </w:r>
           </w:p>
         </w:tc>
@@ -2507,7 +2507,7 @@
                 <w:szCs w:val="19"/>
                 <w:rtl/>
               </w:rPr>
-              <w:t xml:space="preserve">Major 1</w:t>
+              <w:t xml:space="preserve">صحة نموذج الكرة</w:t>
             </w:r>
           </w:p>
         </w:tc>
@@ -2637,7 +2637,7 @@
                 <w:szCs w:val="19"/>
                 <w:rtl/>
               </w:rPr>
-              <w:t xml:space="preserve">Major 1, 3</w:t>
+              <w:t xml:space="preserve">دقة الاتجاه ونموذج الكرة</w:t>
             </w:r>
           </w:p>
         </w:tc>
@@ -2767,7 +2767,7 @@
                 <w:szCs w:val="19"/>
                 <w:rtl/>
               </w:rPr>
-              <w:t xml:space="preserve">Major 2 (الأهم)</w:t>
+              <w:t xml:space="preserve">هل نوافذ الصمت ضرورية (الأهم)</w:t>
             </w:r>
           </w:p>
         </w:tc>
@@ -2897,7 +2897,7 @@
                 <w:szCs w:val="19"/>
                 <w:rtl/>
               </w:rPr>
-              <w:t xml:space="preserve">Major 7</w:t>
+              <w:t xml:space="preserve">جدوى نوافذ الصمت وتكلفتها</w:t>
             </w:r>
           </w:p>
         </w:tc>
@@ -3027,7 +3027,7 @@
                 <w:szCs w:val="19"/>
                 <w:rtl/>
               </w:rPr>
-              <w:t xml:space="preserve">Major 7, Minor 9</w:t>
+              <w:t xml:space="preserve">دقة تقدير المسافة</w:t>
             </w:r>
           </w:p>
         </w:tc>
@@ -3157,7 +3157,7 @@
                 <w:szCs w:val="19"/>
                 <w:rtl/>
               </w:rPr>
-              <w:t xml:space="preserve">Major 5</w:t>
+              <w:t xml:space="preserve">تعميم البصمة</w:t>
             </w:r>
           </w:p>
         </w:tc>
@@ -3287,7 +3287,7 @@
                 <w:szCs w:val="19"/>
                 <w:rtl/>
               </w:rPr>
-              <w:t xml:space="preserve">Major 6</w:t>
+              <w:t xml:space="preserve">أداء المحطة الحقيقي</w:t>
             </w:r>
           </w:p>
         </w:tc>
@@ -3417,7 +3417,7 @@
                 <w:szCs w:val="19"/>
                 <w:rtl/>
               </w:rPr>
-              <w:t xml:space="preserve">Major 1, 8</w:t>
+              <w:t xml:space="preserve">تم (القسم 7.6 في المقالة)</w:t>
             </w:r>
           </w:p>
         </w:tc>

</xml_diff>